<commit_message>
fix: repair mangled \textbf in S&P500 table (was TAB+extbf); best values now bold; drop placeholder 6.x heading
Co-Authored-By: Claude Opus 4.8 (1M context) <noreply@anthropic.com>
</commit_message>
<xml_diff>
--- a/docs/paper/soict_paper_complete_with_sp500.docx
+++ b/docs/paper/soict_paper_complete_with_sp500.docx
@@ -5609,13 +5609,13 @@
         </w:pict>
       </w:r>
     </w:p>
-    <w:bookmarkStart w:id="22" w:name="x-cross-market-check-sp-500-exploratory"/>
+    <w:bookmarkStart w:id="22" w:name="cross-market-check-sp-500-exploratory"/>
     <w:p>
       <w:pPr>
         <w:pStyle w:val="Heading3"/>
       </w:pPr>
       <w:r>
-        <w:t xml:space="preserve">6.x Cross-market check (S&amp;P 500, exploratory)</w:t>
+        <w:t xml:space="preserve">Cross-market check (S&amp;P 500, exploratory)</w:t>
       </w:r>
     </w:p>
     <w:p>

</xml_diff>

<commit_message>
paper (discussion version): add output-parameterization robustness subsection + 5-seed QLIKE table
Node-scaled ratio parameterization is the primary QLIKE-stability driver (std 0.043->0.005 VN30, 0.039->0.004 VN100); positive links add less + remove floor; exp vs softplus not sig after bias-match; HAR mean lower but DM ns. Statistically careful wording (no equivalence claim). Submitted VN-only paper unchanged.

Co-Authored-By: Claude Opus 4.8 (1M context) <noreply@anthropic.com>
</commit_message>
<xml_diff>
--- a/docs/paper/soict_paper_complete_with_sp500.docx
+++ b/docs/paper/soict_paper_complete_with_sp500.docx
@@ -2,7 +2,7 @@
 <file path=word/document.xml><?xml version="1.0" encoding="utf-8"?>
 <w:document xmlns:w="http://schemas.openxmlformats.org/wordprocessingml/2006/main" xmlns:m="http://schemas.openxmlformats.org/officeDocument/2006/math" xmlns:r="http://schemas.openxmlformats.org/officeDocument/2006/relationships" xmlns:o="urn:schemas-microsoft-com:office:office" xmlns:v="urn:schemas-microsoft-com:vml" xmlns:w10="urn:schemas-microsoft-com:office:word" xmlns:a="http://schemas.openxmlformats.org/drawingml/2006/main" xmlns:pic="http://schemas.openxmlformats.org/drawingml/2006/picture" xmlns:wp="http://schemas.openxmlformats.org/drawingml/2006/wordprocessingDrawing">
   <w:body>
-    <w:bookmarkStart w:id="27" w:name="Xba1d549e648012001271c6119321cf99675df6b"/>
+    <w:bookmarkStart w:id="28" w:name="Xba1d549e648012001271c6119321cf99675df6b"/>
     <w:p>
       <w:pPr>
         <w:pStyle w:val="Heading1"/>
@@ -1419,7 +1419,7 @@
       </w:r>
     </w:p>
     <w:bookmarkEnd w:id="21"/>
-    <w:bookmarkStart w:id="23" w:name="results"/>
+    <w:bookmarkStart w:id="24" w:name="results"/>
     <w:p>
       <w:pPr>
         <w:pStyle w:val="Heading2"/>
@@ -6810,14 +6810,13 @@
       </w:r>
     </w:p>
     <w:bookmarkEnd w:id="22"/>
-    <w:bookmarkEnd w:id="23"/>
-    <w:bookmarkStart w:id="24" w:name="discussion"/>
+    <w:bookmarkStart w:id="23" w:name="X8f5eb77d63af8174c4dd2cc2808fc6c07cea8db"/>
     <w:p>
       <w:pPr>
-        <w:pStyle w:val="Heading2"/>
-      </w:pPr>
-      <w:r>
-        <w:t xml:space="preserve">7. Discussion</w:t>
+        <w:pStyle w:val="Heading3"/>
+      </w:pPr>
+      <w:r>
+        <w:t xml:space="preserve">Output parameterization and QLIKE stability (robustness)</w:t>
       </w:r>
     </w:p>
     <w:p>
@@ -6825,55 +6824,67 @@
         <w:pStyle w:val="FirstParagraph"/>
       </w:pPr>
       <w:r>
-        <w:t xml:space="preserve">On both panels HAR has the lowest QLIKE at every horizon, and no learned model has a significantly lower QLIKE</w:t>
-      </w:r>
-      <w:r>
-        <w:t xml:space="preserve"> </w:t>
-      </w:r>
-      <w:r>
-        <w:t xml:space="preserve">than HAR under the date-clustered DM test. At h1 and h5 the LSTM and LSTM+GAT have the lowest MAE on VN100</w:t>
-      </w:r>
-      <w:r>
-        <w:t xml:space="preserve"> </w:t>
-      </w:r>
-      <w:r>
-        <w:t xml:space="preserve">(LSTM versus HAR, p&lt;0.001), and the LSTM+GAT has a significantly lower QLIKE and, on VN30, lower squared error</w:t>
-      </w:r>
-      <w:r>
-        <w:t xml:space="preserve"> </w:t>
-      </w:r>
-      <w:r>
-        <w:t xml:space="preserve">than the same-feature no-graph LSTM; at VN100 h1 and VN30 h1 the LSTM+GAT has the lowest value on four or five</w:t>
-      </w:r>
-      <w:r>
-        <w:t xml:space="preserve"> </w:t>
-      </w:r>
-      <w:r>
-        <w:t xml:space="preserve">of the metrics. At h10 and h22 HAR has the lowest MSE, RMSE, QLIKE and R², and the LSTM+GAT-versus-LSTM QLIKE</w:t>
-      </w:r>
-      <w:r>
-        <w:t xml:space="preserve"> </w:t>
-      </w:r>
-      <w:r>
-        <w:t xml:space="preserve">difference is not significant. The graph’s effect on QLIKE relative to the no-graph LSTM is therefore present</w:t>
-      </w:r>
-      <w:r>
-        <w:t xml:space="preserve"> </w:t>
-      </w:r>
-      <w:r>
-        <w:t xml:space="preserve">at the short horizons and absent at the longer horizons; the deep models’ MAE reduction is present at the</w:t>
-      </w:r>
-      <w:r>
-        <w:t xml:space="preserve"> </w:t>
-      </w:r>
-      <w:r>
-        <w:t xml:space="preserve">short horizons on VN100 and reverses at the longer horizons, where their squared error and MAE are higher than</w:t>
-      </w:r>
-      <w:r>
-        <w:t xml:space="preserve"> </w:t>
-      </w:r>
-      <w:r>
-        <w:t xml:space="preserve">HAR’s.</w:t>
+        <w:t xml:space="preserve">The deep model’s QLIKE was sensitive to the random seed under the additive standardized-target design with a</w:t>
+      </w:r>
+      <w:r>
+        <w:t xml:space="preserve"> </w:t>
+      </w:r>
+      <w:r>
+        <w:t xml:space="preserve">post-hoc floor. Replacing that target with a node-scaled ratio (the model predicts y_t / mean_i and</w:t>
+      </w:r>
+      <w:r>
+        <w:t xml:space="preserve"> </w:t>
+      </w:r>
+      <w:r>
+        <w:t xml:space="preserve">reconstructs the forecast as the ratio times the training-period node mean) reduces the five-seed QLIKE</w:t>
+      </w:r>
+      <w:r>
+        <w:t xml:space="preserve"> </w:t>
+      </w:r>
+      <w:r>
+        <w:t xml:space="preserve">standard deviation from 0.043 to 0.005 (VN30) and from 0.039 to 0.004 (VN100), with the same linear output</w:t>
+      </w:r>
+      <w:r>
+        <w:t xml:space="preserve"> </w:t>
+      </w:r>
+      <w:r>
+        <w:t xml:space="preserve">and floor — identifying node scaling, rather than the positive output link, as the primary source of</w:t>
+      </w:r>
+      <w:r>
+        <w:t xml:space="preserve"> </w:t>
+      </w:r>
+      <w:r>
+        <w:t xml:space="preserve">stability. Positive links (exponential or softplus) provide smaller additional improvements and remove the</w:t>
+      </w:r>
+      <w:r>
+        <w:t xml:space="preserve"> </w:t>
+      </w:r>
+      <w:r>
+        <w:t xml:space="preserve">post-hoc floor; no statistically significant QLIKE difference was detected between them at the 5% level after</w:t>
+      </w:r>
+      <w:r>
+        <w:t xml:space="preserve"> </w:t>
+      </w:r>
+      <w:r>
+        <w:t xml:space="preserve">bias-matched initialization. HAR retains a lower mean QLIKE, but its advantage over the ratio-parameterized</w:t>
+      </w:r>
+      <w:r>
+        <w:t xml:space="preserve"> </w:t>
+      </w:r>
+      <w:r>
+        <w:t xml:space="preserve">deep model is not statistically significant under the date-clustered DM test (VN30 p=0.29, VN100 p=0.60); a</w:t>
+      </w:r>
+      <w:r>
+        <w:t xml:space="preserve"> </w:t>
+      </w:r>
+      <w:r>
+        <w:t xml:space="preserve">failure to reject does not establish equivalence. This indicates the earlier instability was largely</w:t>
+      </w:r>
+      <w:r>
+        <w:t xml:space="preserve"> </w:t>
+      </w:r>
+      <w:r>
+        <w:t xml:space="preserve">attributable to the target parameterization rather than the forecasting architecture.</w:t>
       </w:r>
     </w:p>
     <w:p>
@@ -6881,27 +6892,220 @@
         <w:pStyle w:val="BodyText"/>
       </w:pPr>
       <w:r>
-        <w:t xml:space="preserve">The ranking is metric- and horizon-dependent, which is why all five metrics are reported with equal weight.</w:t>
-      </w:r>
-      <w:r>
-        <w:t xml:space="preserve"> </w:t>
-      </w:r>
-      <w:r>
-        <w:t xml:space="preserve">The date-clustered DM test matters for these conclusions: a naive per-observation test on this</w:t>
-      </w:r>
-      <w:r>
-        <w:t xml:space="preserve"> </w:t>
-      </w:r>
-      <w:r>
-        <w:t xml:space="preserve">cross-sectionally dependent panel inflates the statistic by a factor on the order of the square root of the</w:t>
-      </w:r>
-      <w:r>
-        <w:t xml:space="preserve"> </w:t>
-      </w:r>
-      <w:r>
-        <w:t xml:space="preserve">cross-section size, so a difference that is not significant per date can appear significant per observation.</w:t>
+        <w:rPr>
+          <w:b/>
+          <w:bCs/>
+        </w:rPr>
+        <w:t xml:space="preserve">Table. Output-parameterization robustness (LSTM, h5, 5 seeds): QLIKE mean ± std.</w:t>
+      </w:r>
+      <w:r>
+        <w:t xml:space="preserve"> </w:t>
+      </w:r>
+      <w:r>
+        <w:t xml:space="preserve">A: z-score + linear +</w:t>
+      </w:r>
+      <w:r>
+        <w:t xml:space="preserve"> </w:t>
+      </w:r>
+      <w:r>
+        <w:t xml:space="preserve">floor (original); B: ratio + linear + floor; C: ratio + exp (no floor); D: ratio + softplus (no floor). HAR</w:t>
+      </w:r>
+      <w:r>
+        <w:t xml:space="preserve"> </w:t>
+      </w:r>
+      <w:r>
+        <w:t xml:space="preserve">QLIKE is 0.5962 (VN30) and 0.5694 (VN100).</w:t>
       </w:r>
     </w:p>
+    <w:tbl>
+      <w:tblPr>
+        <w:tblStyle w:val="Table"/>
+        <w:tblW w:type="pct" w:w="5000"/>
+        <w:tblLayout w:type="fixed"/>
+        <w:tblLook w:firstRow="1" w:lastRow="0" w:firstColumn="0" w:lastColumn="0" w:noHBand="0" w:noVBand="0" w:val="0020"/>
+      </w:tblPr>
+      <w:tblGrid>
+        <w:gridCol w:w="1584"/>
+        <w:gridCol w:w="1584"/>
+        <w:gridCol w:w="1584"/>
+        <w:gridCol w:w="1584"/>
+        <w:gridCol w:w="1584"/>
+      </w:tblGrid>
+      <w:tr>
+        <w:trPr>
+          <w:tblHeader w:val="on"/>
+        </w:trPr>
+        <w:tc>
+          <w:tcPr/>
+          <w:p>
+            <w:pPr>
+              <w:pStyle w:val="Compact"/>
+            </w:pPr>
+            <w:r>
+              <w:t xml:space="preserve">Panel</w:t>
+            </w:r>
+          </w:p>
+        </w:tc>
+        <w:tc>
+          <w:tcPr/>
+          <w:p>
+            <w:pPr>
+              <w:pStyle w:val="Compact"/>
+            </w:pPr>
+            <w:r>
+              <w:t xml:space="preserve">A</w:t>
+            </w:r>
+          </w:p>
+        </w:tc>
+        <w:tc>
+          <w:tcPr/>
+          <w:p>
+            <w:pPr>
+              <w:pStyle w:val="Compact"/>
+            </w:pPr>
+            <w:r>
+              <w:t xml:space="preserve">B</w:t>
+            </w:r>
+          </w:p>
+        </w:tc>
+        <w:tc>
+          <w:tcPr/>
+          <w:p>
+            <w:pPr>
+              <w:pStyle w:val="Compact"/>
+            </w:pPr>
+            <w:r>
+              <w:t xml:space="preserve">C</w:t>
+            </w:r>
+          </w:p>
+        </w:tc>
+        <w:tc>
+          <w:tcPr/>
+          <w:p>
+            <w:pPr>
+              <w:pStyle w:val="Compact"/>
+            </w:pPr>
+            <w:r>
+              <w:t xml:space="preserve">D</w:t>
+            </w:r>
+          </w:p>
+        </w:tc>
+      </w:tr>
+      <w:tr>
+        <w:tc>
+          <w:tcPr/>
+          <w:p>
+            <w:pPr>
+              <w:pStyle w:val="Compact"/>
+            </w:pPr>
+            <w:r>
+              <w:t xml:space="preserve">VN30</w:t>
+            </w:r>
+          </w:p>
+        </w:tc>
+        <w:tc>
+          <w:tcPr/>
+          <w:p>
+            <w:pPr>
+              <w:pStyle w:val="Compact"/>
+            </w:pPr>
+            <w:r>
+              <w:t xml:space="preserve">0.660 ± 0.043</w:t>
+            </w:r>
+          </w:p>
+        </w:tc>
+        <w:tc>
+          <w:tcPr/>
+          <w:p>
+            <w:pPr>
+              <w:pStyle w:val="Compact"/>
+            </w:pPr>
+            <w:r>
+              <w:t xml:space="preserve">0.613 ± 0.005</w:t>
+            </w:r>
+          </w:p>
+        </w:tc>
+        <w:tc>
+          <w:tcPr/>
+          <w:p>
+            <w:pPr>
+              <w:pStyle w:val="Compact"/>
+            </w:pPr>
+            <w:r>
+              <w:t xml:space="preserve">0.610 ± 0.002</w:t>
+            </w:r>
+          </w:p>
+        </w:tc>
+        <w:tc>
+          <w:tcPr/>
+          <w:p>
+            <w:pPr>
+              <w:pStyle w:val="Compact"/>
+            </w:pPr>
+            <w:r>
+              <w:t xml:space="preserve">0.610 ± 0.003</w:t>
+            </w:r>
+          </w:p>
+        </w:tc>
+      </w:tr>
+      <w:tr>
+        <w:tc>
+          <w:tcPr/>
+          <w:p>
+            <w:pPr>
+              <w:pStyle w:val="Compact"/>
+            </w:pPr>
+            <w:r>
+              <w:t xml:space="preserve">VN100</w:t>
+            </w:r>
+          </w:p>
+        </w:tc>
+        <w:tc>
+          <w:tcPr/>
+          <w:p>
+            <w:pPr>
+              <w:pStyle w:val="Compact"/>
+            </w:pPr>
+            <w:r>
+              <w:t xml:space="preserve">0.602 ± 0.039</w:t>
+            </w:r>
+          </w:p>
+        </w:tc>
+        <w:tc>
+          <w:tcPr/>
+          <w:p>
+            <w:pPr>
+              <w:pStyle w:val="Compact"/>
+            </w:pPr>
+            <w:r>
+              <w:t xml:space="preserve">0.572 ± 0.004</w:t>
+            </w:r>
+          </w:p>
+        </w:tc>
+        <w:tc>
+          <w:tcPr/>
+          <w:p>
+            <w:pPr>
+              <w:pStyle w:val="Compact"/>
+            </w:pPr>
+            <w:r>
+              <w:t xml:space="preserve">0.573 ± 0.003</w:t>
+            </w:r>
+          </w:p>
+        </w:tc>
+        <w:tc>
+          <w:tcPr/>
+          <w:p>
+            <w:pPr>
+              <w:pStyle w:val="Compact"/>
+            </w:pPr>
+            <w:r>
+              <w:t xml:space="preserve">0.576 ± 0.007</w:t>
+            </w:r>
+          </w:p>
+        </w:tc>
+      </w:tr>
+    </w:tbl>
     <w:p>
       <w:r>
         <w:pict>
@@ -6909,14 +7113,15 @@
         </w:pict>
       </w:r>
     </w:p>
+    <w:bookmarkEnd w:id="23"/>
     <w:bookmarkEnd w:id="24"/>
-    <w:bookmarkStart w:id="25" w:name="conclusion"/>
+    <w:bookmarkStart w:id="25" w:name="discussion"/>
     <w:p>
       <w:pPr>
         <w:pStyle w:val="Heading2"/>
       </w:pPr>
       <w:r>
-        <w:t xml:space="preserve">8. Conclusion</w:t>
+        <w:t xml:space="preserve">7. Discussion</w:t>
       </w:r>
     </w:p>
     <w:p>
@@ -6924,49 +7129,81 @@
         <w:pStyle w:val="FirstParagraph"/>
       </w:pPr>
       <w:r>
-        <w:t xml:space="preserve">For daily Parkinson-variance forecasting on the Vietnamese market, evaluated with the same features, the same</w:t>
-      </w:r>
-      <w:r>
-        <w:t xml:space="preserve"> </w:t>
-      </w:r>
-      <w:r>
-        <w:t xml:space="preserve">masked panel and the same date-clustered Diebold–Mariano inference, HAR has the lowest QLIKE at</w:t>
-      </w:r>
-      <w:r>
-        <w:t xml:space="preserve"> </w:t>
-      </w:r>
-      <w:r>
-        <w:t xml:space="preserve">every horizon on both panels and no learned model has a significantly lower QLIKE than HAR. At the short</w:t>
-      </w:r>
-      <w:r>
-        <w:t xml:space="preserve"> </w:t>
-      </w:r>
-      <w:r>
-        <w:t xml:space="preserve">horizons (h1, h5) the LSTM and LSTM+GAT have the lowest MAE on VN100, and the directed volume→Parkinson</w:t>
-      </w:r>
-      <w:r>
-        <w:t xml:space="preserve"> </w:t>
-      </w:r>
-      <w:r>
-        <w:t xml:space="preserve">weighted graph gives the LSTM+GAT a significantly lower QLIKE than the same-feature no-graph LSTM in both</w:t>
-      </w:r>
-      <w:r>
-        <w:t xml:space="preserve"> </w:t>
-      </w:r>
-      <w:r>
-        <w:t xml:space="preserve">panels, equal to HAR’s QLIKE level at VN100 h5; at the extended horizons (h10, h22) HAR has the lowest MSE,</w:t>
-      </w:r>
-      <w:r>
-        <w:t xml:space="preserve"> </w:t>
-      </w:r>
-      <w:r>
-        <w:t xml:space="preserve">RMSE, QLIKE and R², and the graph’s QLIKE difference from the no-graph LSTM is not significant. The ranking is</w:t>
-      </w:r>
-      <w:r>
-        <w:t xml:space="preserve"> </w:t>
-      </w:r>
-      <w:r>
-        <w:t xml:space="preserve">metric- and horizon-dependent, so all five metrics are reported with equal weight.</w:t>
+        <w:t xml:space="preserve">On both panels HAR has the lowest QLIKE at every horizon, and no learned model has a significantly lower QLIKE</w:t>
+      </w:r>
+      <w:r>
+        <w:t xml:space="preserve"> </w:t>
+      </w:r>
+      <w:r>
+        <w:t xml:space="preserve">than HAR under the date-clustered DM test. At h1 and h5 the LSTM and LSTM+GAT have the lowest MAE on VN100</w:t>
+      </w:r>
+      <w:r>
+        <w:t xml:space="preserve"> </w:t>
+      </w:r>
+      <w:r>
+        <w:t xml:space="preserve">(LSTM versus HAR, p&lt;0.001), and the LSTM+GAT has a significantly lower QLIKE and, on VN30, lower squared error</w:t>
+      </w:r>
+      <w:r>
+        <w:t xml:space="preserve"> </w:t>
+      </w:r>
+      <w:r>
+        <w:t xml:space="preserve">than the same-feature no-graph LSTM; at VN100 h1 and VN30 h1 the LSTM+GAT has the lowest value on four or five</w:t>
+      </w:r>
+      <w:r>
+        <w:t xml:space="preserve"> </w:t>
+      </w:r>
+      <w:r>
+        <w:t xml:space="preserve">of the metrics. At h10 and h22 HAR has the lowest MSE, RMSE, QLIKE and R², and the LSTM+GAT-versus-LSTM QLIKE</w:t>
+      </w:r>
+      <w:r>
+        <w:t xml:space="preserve"> </w:t>
+      </w:r>
+      <w:r>
+        <w:t xml:space="preserve">difference is not significant. The graph’s effect on QLIKE relative to the no-graph LSTM is therefore present</w:t>
+      </w:r>
+      <w:r>
+        <w:t xml:space="preserve"> </w:t>
+      </w:r>
+      <w:r>
+        <w:t xml:space="preserve">at the short horizons and absent at the longer horizons; the deep models’ MAE reduction is present at the</w:t>
+      </w:r>
+      <w:r>
+        <w:t xml:space="preserve"> </w:t>
+      </w:r>
+      <w:r>
+        <w:t xml:space="preserve">short horizons on VN100 and reverses at the longer horizons, where their squared error and MAE are higher than</w:t>
+      </w:r>
+      <w:r>
+        <w:t xml:space="preserve"> </w:t>
+      </w:r>
+      <w:r>
+        <w:t xml:space="preserve">HAR’s.</w:t>
+      </w:r>
+    </w:p>
+    <w:p>
+      <w:pPr>
+        <w:pStyle w:val="BodyText"/>
+      </w:pPr>
+      <w:r>
+        <w:t xml:space="preserve">The ranking is metric- and horizon-dependent, which is why all five metrics are reported with equal weight.</w:t>
+      </w:r>
+      <w:r>
+        <w:t xml:space="preserve"> </w:t>
+      </w:r>
+      <w:r>
+        <w:t xml:space="preserve">The date-clustered DM test matters for these conclusions: a naive per-observation test on this</w:t>
+      </w:r>
+      <w:r>
+        <w:t xml:space="preserve"> </w:t>
+      </w:r>
+      <w:r>
+        <w:t xml:space="preserve">cross-sectionally dependent panel inflates the statistic by a factor on the order of the square root of the</w:t>
+      </w:r>
+      <w:r>
+        <w:t xml:space="preserve"> </w:t>
+      </w:r>
+      <w:r>
+        <w:t xml:space="preserve">cross-section size, so a difference that is not significant per date can appear significant per observation.</w:t>
       </w:r>
     </w:p>
     <w:p>
@@ -6977,7 +7214,74 @@
       </w:r>
     </w:p>
     <w:bookmarkEnd w:id="25"/>
-    <w:bookmarkStart w:id="26" w:name="references"/>
+    <w:bookmarkStart w:id="26" w:name="conclusion"/>
+    <w:p>
+      <w:pPr>
+        <w:pStyle w:val="Heading2"/>
+      </w:pPr>
+      <w:r>
+        <w:t xml:space="preserve">8. Conclusion</w:t>
+      </w:r>
+    </w:p>
+    <w:p>
+      <w:pPr>
+        <w:pStyle w:val="FirstParagraph"/>
+      </w:pPr>
+      <w:r>
+        <w:t xml:space="preserve">For daily Parkinson-variance forecasting on the Vietnamese market, evaluated with the same features, the same</w:t>
+      </w:r>
+      <w:r>
+        <w:t xml:space="preserve"> </w:t>
+      </w:r>
+      <w:r>
+        <w:t xml:space="preserve">masked panel and the same date-clustered Diebold–Mariano inference, HAR has the lowest QLIKE at</w:t>
+      </w:r>
+      <w:r>
+        <w:t xml:space="preserve"> </w:t>
+      </w:r>
+      <w:r>
+        <w:t xml:space="preserve">every horizon on both panels and no learned model has a significantly lower QLIKE than HAR. At the short</w:t>
+      </w:r>
+      <w:r>
+        <w:t xml:space="preserve"> </w:t>
+      </w:r>
+      <w:r>
+        <w:t xml:space="preserve">horizons (h1, h5) the LSTM and LSTM+GAT have the lowest MAE on VN100, and the directed volume→Parkinson</w:t>
+      </w:r>
+      <w:r>
+        <w:t xml:space="preserve"> </w:t>
+      </w:r>
+      <w:r>
+        <w:t xml:space="preserve">weighted graph gives the LSTM+GAT a significantly lower QLIKE than the same-feature no-graph LSTM in both</w:t>
+      </w:r>
+      <w:r>
+        <w:t xml:space="preserve"> </w:t>
+      </w:r>
+      <w:r>
+        <w:t xml:space="preserve">panels, equal to HAR’s QLIKE level at VN100 h5; at the extended horizons (h10, h22) HAR has the lowest MSE,</w:t>
+      </w:r>
+      <w:r>
+        <w:t xml:space="preserve"> </w:t>
+      </w:r>
+      <w:r>
+        <w:t xml:space="preserve">RMSE, QLIKE and R², and the graph’s QLIKE difference from the no-graph LSTM is not significant. The ranking is</w:t>
+      </w:r>
+      <w:r>
+        <w:t xml:space="preserve"> </w:t>
+      </w:r>
+      <w:r>
+        <w:t xml:space="preserve">metric- and horizon-dependent, so all five metrics are reported with equal weight.</w:t>
+      </w:r>
+    </w:p>
+    <w:p>
+      <w:r>
+        <w:pict>
+          <v:rect style="width:0;height:1.5pt" o:hralign="center" o:hrstd="t" o:hr="t"/>
+        </w:pict>
+      </w:r>
+    </w:p>
+    <w:bookmarkEnd w:id="26"/>
+    <w:bookmarkStart w:id="27" w:name="references"/>
     <w:p>
       <w:pPr>
         <w:pStyle w:val="Heading2"/>
@@ -7428,8 +7732,8 @@
         <w:t xml:space="preserve">.</w:t>
       </w:r>
     </w:p>
-    <w:bookmarkEnd w:id="26"/>
     <w:bookmarkEnd w:id="27"/>
+    <w:bookmarkEnd w:id="28"/>
     <w:sectPr>
       <w:footnotePr>
         <w:numRestart w:val="eachSect"/>

</xml_diff>

<commit_message>
robustness: common-floor sensitivity + corrected wording (relative floor, cause attribution, no 'win'/'equivalence', pre-specification framing)
Per reviewer: main tables keep the pre-specified z-score+linear+relative-floor config; config C + common-floor are a robustness supplement (avoid test-set-driven selection). Common-floor re-score from raw forecasts (relative vs 1e-8): <0.01% clipped, identical at h5-h22; h1 sensitivity is on HAR-X (unconstrained linear + near-zero forecasts + tight floor), not the deep architecture; ratio-exp removed it. At h1 ratio-exp deep has lower mean QLIKE than HAR-X under relative floor but DM not significant (no win/tie claimed). Config C = pre-specified candidate for future OOS/walk-forward, not a main-table replacement. Report + floor_sensitivity JSONs.

Co-Authored-By: Claude Opus 4.8 (1M context) <noreply@anthropic.com>
</commit_message>
<xml_diff>
--- a/docs/paper/soict_paper_complete_with_sp500.docx
+++ b/docs/paper/soict_paper_complete_with_sp500.docx
@@ -6824,67 +6824,139 @@
         <w:pStyle w:val="FirstParagraph"/>
       </w:pPr>
       <w:r>
-        <w:t xml:space="preserve">The deep model’s QLIKE was sensitive to the random seed under the additive standardized-target design with a</w:t>
-      </w:r>
-      <w:r>
-        <w:t xml:space="preserve"> </w:t>
-      </w:r>
-      <w:r>
-        <w:t xml:space="preserve">post-hoc floor. Replacing that target with a node-scaled ratio (the model predicts y_t / mean_i and</w:t>
-      </w:r>
-      <w:r>
-        <w:t xml:space="preserve"> </w:t>
-      </w:r>
-      <w:r>
-        <w:t xml:space="preserve">reconstructs the forecast as the ratio times the training-period node mean) reduces the five-seed QLIKE</w:t>
-      </w:r>
-      <w:r>
-        <w:t xml:space="preserve"> </w:t>
-      </w:r>
-      <w:r>
-        <w:t xml:space="preserve">standard deviation from 0.043 to 0.005 (VN30) and from 0.039 to 0.004 (VN100), with the same linear output</w:t>
-      </w:r>
-      <w:r>
-        <w:t xml:space="preserve"> </w:t>
-      </w:r>
-      <w:r>
-        <w:t xml:space="preserve">and floor — identifying node scaling, rather than the positive output link, as the primary source of</w:t>
-      </w:r>
-      <w:r>
-        <w:t xml:space="preserve"> </w:t>
-      </w:r>
-      <w:r>
-        <w:t xml:space="preserve">stability. Positive links (exponential or softplus) provide smaller additional improvements and remove the</w:t>
-      </w:r>
-      <w:r>
-        <w:t xml:space="preserve"> </w:t>
-      </w:r>
-      <w:r>
-        <w:t xml:space="preserve">post-hoc floor; no statistically significant QLIKE difference was detected between them at the 5% level after</w:t>
-      </w:r>
-      <w:r>
-        <w:t xml:space="preserve"> </w:t>
-      </w:r>
-      <w:r>
-        <w:t xml:space="preserve">bias-matched initialization. HAR-X retains a lower mean QLIKE, but its advantage over the ratio-parameterized</w:t>
-      </w:r>
-      <w:r>
-        <w:t xml:space="preserve"> </w:t>
-      </w:r>
-      <w:r>
-        <w:t xml:space="preserve">deep model is not statistically significant under the date-clustered DM test (VN30 p=0.29, VN100 p=0.60); a</w:t>
-      </w:r>
-      <w:r>
-        <w:t xml:space="preserve"> </w:t>
-      </w:r>
-      <w:r>
-        <w:t xml:space="preserve">failure to reject does not establish equivalence. This indicates the earlier instability was largely</w:t>
-      </w:r>
-      <w:r>
-        <w:t xml:space="preserve"> </w:t>
-      </w:r>
-      <w:r>
-        <w:t xml:space="preserve">attributable to the target parameterization rather than the forecasting architecture.</w:t>
+        <w:t xml:space="preserve">The output parameterization used in the main tables — a standardized target with a linear output and a</w:t>
+      </w:r>
+      <w:r>
+        <w:t xml:space="preserve"> </w:t>
+      </w:r>
+      <w:r>
+        <w:t xml:space="preserve">relative floor of 1e-2 times the per-node training mean — was fixed before this investigation. As a</w:t>
+      </w:r>
+      <w:r>
+        <w:t xml:space="preserve"> </w:t>
+      </w:r>
+      <w:r>
+        <w:t xml:space="preserve">robustness check we varied only the deep model’s output mapping. Replacing the standardized target with a</w:t>
+      </w:r>
+      <w:r>
+        <w:t xml:space="preserve"> </w:t>
+      </w:r>
+      <w:r>
+        <w:t xml:space="preserve">node-scaled ratio (the model predicts y_t / mean_i and reconstructs the forecast as the ratio times the</w:t>
+      </w:r>
+      <w:r>
+        <w:t xml:space="preserve"> </w:t>
+      </w:r>
+      <w:r>
+        <w:t xml:space="preserve">training-period node mean) reduces the five-seed QLIKE standard deviation from 0.043 to 0.005 (VN30) and from</w:t>
+      </w:r>
+      <w:r>
+        <w:t xml:space="preserve"> </w:t>
+      </w:r>
+      <w:r>
+        <w:t xml:space="preserve">0.039 to 0.004 (VN100) with the same linear output and floor; a positive-by-construction link (exponential or</w:t>
+      </w:r>
+      <w:r>
+        <w:t xml:space="preserve"> </w:t>
+      </w:r>
+      <w:r>
+        <w:t xml:space="preserve">softplus) provides smaller additional improvements and removes the floor. No statistically significant QLIKE</w:t>
+      </w:r>
+      <w:r>
+        <w:t xml:space="preserve"> </w:t>
+      </w:r>
+      <w:r>
+        <w:t xml:space="preserve">difference was detected between the exponential and softplus links at the 5% level after bias-matched</w:t>
+      </w:r>
+      <w:r>
+        <w:t xml:space="preserve"> </w:t>
+      </w:r>
+      <w:r>
+        <w:t xml:space="preserve">initialization.</w:t>
+      </w:r>
+    </w:p>
+    <w:p>
+      <w:pPr>
+        <w:pStyle w:val="BodyText"/>
+      </w:pPr>
+      <w:r>
+        <w:rPr>
+          <w:b/>
+          <w:bCs/>
+        </w:rPr>
+        <w:t xml:space="preserve">Common-floor sensitivity.</w:t>
+      </w:r>
+      <w:r>
+        <w:t xml:space="preserve"> </w:t>
+      </w:r>
+      <w:r>
+        <w:t xml:space="preserve">Because the main tables pre-floor HAR-X at the relative floor before the</w:t>
+      </w:r>
+      <w:r>
+        <w:t xml:space="preserve"> </w:t>
+      </w:r>
+      <w:r>
+        <w:t xml:space="preserve">metric, we re-score every model from raw forecasts under a single common floor applied identically to all</w:t>
+      </w:r>
+      <w:r>
+        <w:t xml:space="preserve"> </w:t>
+      </w:r>
+      <w:r>
+        <w:t xml:space="preserve">models, using either the relative floor or a fixed 1e-8 floor. Under both policies fewer than 0.01% of</w:t>
+      </w:r>
+      <w:r>
+        <w:t xml:space="preserve"> </w:t>
+      </w:r>
+      <w:r>
+        <w:t xml:space="preserve">forecasts are clipped, and at h5, h10 and h22 the QLIKE values and the deep-vs-HAR-X DM outcome are</w:t>
+      </w:r>
+      <w:r>
+        <w:t xml:space="preserve"> </w:t>
+      </w:r>
+      <w:r>
+        <w:t xml:space="preserve">identical. Only h1 is floor-sensitive, and the sensitivity is on the HAR-X side: extreme h1 QLIKE values</w:t>
+      </w:r>
+      <w:r>
+        <w:t xml:space="preserve"> </w:t>
+      </w:r>
+      <w:r>
+        <w:t xml:space="preserve">arose from a very small number of non-positive or near-zero forecasts produced by the unconstrained linear</w:t>
+      </w:r>
+      <w:r>
+        <w:t xml:space="preserve"> </w:t>
+      </w:r>
+      <w:r>
+        <w:t xml:space="preserve">output and subsequently mapped to a tight numerical floor; the positive-by-construction ratio-exp</w:t>
+      </w:r>
+      <w:r>
+        <w:t xml:space="preserve"> </w:t>
+      </w:r>
+      <w:r>
+        <w:t xml:space="preserve">parameterization removed this sensitivity. At h1, the ratio-exp deep model obtained a lower mean QLIKE than</w:t>
+      </w:r>
+      <w:r>
+        <w:t xml:space="preserve"> </w:t>
+      </w:r>
+      <w:r>
+        <w:t xml:space="preserve">HAR-X under the relative-floor policy, but no statistically significant difference was detected (VN100</w:t>
+      </w:r>
+      <w:r>
+        <w:t xml:space="preserve"> </w:t>
+      </w:r>
+      <w:r>
+        <w:t xml:space="preserve">p=0.24, VN30 p=0.57). These configurations were identified after observing QLIKE on the same test set, so</w:t>
+      </w:r>
+      <w:r>
+        <w:t xml:space="preserve"> </w:t>
+      </w:r>
+      <w:r>
+        <w:t xml:space="preserve">they are reported as a robustness result and as a pre-specified candidate for a future out-of-sample or</w:t>
+      </w:r>
+      <w:r>
+        <w:t xml:space="preserve"> </w:t>
+      </w:r>
+      <w:r>
+        <w:t xml:space="preserve">walk-forward evaluation, not as a replacement for the main-table specification.</w:t>
       </w:r>
     </w:p>
     <w:p>

</xml_diff>